<commit_message>
Optimize UUID update process with lazy-loading caches and add technical documentation
</commit_message>
<xml_diff>
--- a/Doc transporte SCTASK2358770 SAP Corporativo.docx
+++ b/Doc transporte SCTASK2358770 SAP Corporativo.docx
@@ -710,7 +710,23 @@
               <w:pStyle w:val="Sinespaciado"/>
             </w:pPr>
             <w:r>
-              <w:t>Dado que en septiembre de 2025 se va a deprecar la autenticación básica para el envío de correos (https://techcommunity.microsoft.com/blog/exchange/exchange-online-to-retire-basic-auth-for-client-submission-smtp-auth/4114750).</w:t>
+              <w:t xml:space="preserve">Se requiere hacer un desarrollo que permita automatizar el registro del código UUID (en el campo "CFDI: Identificador </w:t>
+            </w:r>
+            <w:proofErr w:type="spellStart"/>
+            <w:r>
+              <w:t>Unico</w:t>
+            </w:r>
+            <w:proofErr w:type="spellEnd"/>
+            <w:r>
+              <w:t xml:space="preserve">" en SAP) para los registros contabilizados, tomando el UUID de los </w:t>
+            </w:r>
+            <w:proofErr w:type="spellStart"/>
+            <w:r>
+              <w:t>PDFs</w:t>
+            </w:r>
+            <w:proofErr w:type="spellEnd"/>
+            <w:r>
+              <w:t xml:space="preserve"> (facturas) almacenadas en SAP para los registros de 2018 a 2025 inclusive de las siguientes sociedades:</w:t>
             </w:r>
           </w:p>
           <w:p>
@@ -718,21 +734,141 @@
               <w:pStyle w:val="Sinespaciado"/>
             </w:pPr>
             <w:r>
-              <w:t xml:space="preserve">Eso va a generar que las aplicaciones que actualmente envían correos a través del </w:t>
-            </w:r>
-            <w:proofErr w:type="spellStart"/>
-            <w:r>
-              <w:t>relay</w:t>
-            </w:r>
-            <w:proofErr w:type="spellEnd"/>
-            <w:r>
-              <w:t xml:space="preserve"> se tengan que migrar a otra solución.</w:t>
+              <w:t xml:space="preserve">E604 - ACCIONA ENERGIA MEXICO S DE RL DE CV </w:t>
             </w:r>
           </w:p>
           <w:p>
             <w:pPr>
               <w:pStyle w:val="Sinespaciado"/>
             </w:pPr>
+            <w:r>
+              <w:t xml:space="preserve">E606 - EURUS SAPI DE CV </w:t>
+            </w:r>
+          </w:p>
+          <w:p>
+            <w:pPr>
+              <w:pStyle w:val="Sinespaciado"/>
+            </w:pPr>
+            <w:r>
+              <w:t xml:space="preserve">E607 - CE OAXACA DOS S DE RL DE CV </w:t>
+            </w:r>
+          </w:p>
+          <w:p>
+            <w:pPr>
+              <w:pStyle w:val="Sinespaciado"/>
+            </w:pPr>
+            <w:r>
+              <w:t xml:space="preserve">E608 - CE OAXACA TRES S DE RL DE CV </w:t>
+            </w:r>
+          </w:p>
+          <w:p>
+            <w:pPr>
+              <w:pStyle w:val="Sinespaciado"/>
+            </w:pPr>
+            <w:r>
+              <w:t xml:space="preserve">E609 - CE OAXACA CUATRO S DE RL DE CV </w:t>
+            </w:r>
+          </w:p>
+          <w:p>
+            <w:pPr>
+              <w:pStyle w:val="Sinespaciado"/>
+            </w:pPr>
+            <w:r>
+              <w:t xml:space="preserve">E610 - SOCIEDAD ISTMEÑA DESARROLLO EOLICO S DE RL DE CV </w:t>
+            </w:r>
+          </w:p>
+          <w:p>
+            <w:pPr>
+              <w:pStyle w:val="Sinespaciado"/>
+            </w:pPr>
+            <w:r>
+              <w:t xml:space="preserve">E746 - ACCIONA ENERGIA SERVICIOS MEXICO S DE RL DE CV </w:t>
+            </w:r>
+          </w:p>
+          <w:p>
+            <w:pPr>
+              <w:pStyle w:val="Sinespaciado"/>
+            </w:pPr>
+            <w:r>
+              <w:t xml:space="preserve">E752 - AE MEX GLOBAL S DE RL DE CV </w:t>
+            </w:r>
+          </w:p>
+          <w:p>
+            <w:pPr>
+              <w:pStyle w:val="Sinespaciado"/>
+            </w:pPr>
+            <w:r>
+              <w:t xml:space="preserve">E768 - ENERGIA RENOVABLE DEL ISTMO II SA DE CV </w:t>
+            </w:r>
+          </w:p>
+          <w:p>
+            <w:pPr>
+              <w:pStyle w:val="Sinespaciado"/>
+            </w:pPr>
+            <w:r>
+              <w:t xml:space="preserve">E772 - TUTO ENERGY II SAPI DE CV </w:t>
+            </w:r>
+          </w:p>
+          <w:p>
+            <w:pPr>
+              <w:pStyle w:val="Sinespaciado"/>
+            </w:pPr>
+            <w:r>
+              <w:t xml:space="preserve">E782 - ACCIONA EOLICA SANTA CRUZ S. DE R.L DE C.V. </w:t>
+            </w:r>
+          </w:p>
+          <w:p>
+            <w:pPr>
+              <w:pStyle w:val="Sinespaciado"/>
+            </w:pPr>
+            <w:r>
+              <w:t xml:space="preserve">E783 - PARQUES EOLICOS SAN LAZARO, S.A. DE C.V. </w:t>
+            </w:r>
+          </w:p>
+          <w:p>
+            <w:pPr>
+              <w:pStyle w:val="Sinespaciado"/>
+            </w:pPr>
+            <w:r>
+              <w:t xml:space="preserve">ES44 - AT SOLAR V S DE RL DE CV (ALEPH SOLARFIELDS MEXICO S A P I DE CV) </w:t>
+            </w:r>
+          </w:p>
+          <w:p>
+            <w:pPr>
+              <w:pStyle w:val="Sinespaciado"/>
+            </w:pPr>
+            <w:r>
+              <w:t xml:space="preserve">EV06 - ACCIONA SUMINISTRADORA MEXICO S DE RL DE CV </w:t>
+            </w:r>
+          </w:p>
+          <w:p>
+            <w:pPr>
+              <w:pStyle w:val="Sinespaciado"/>
+            </w:pPr>
+          </w:p>
+          <w:p>
+            <w:pPr>
+              <w:pStyle w:val="Sinespaciado"/>
+            </w:pPr>
+            <w:r>
+              <w:t>Esto para todos los registros proveedor tipo KR, KA, RC, RE.</w:t>
+            </w:r>
+          </w:p>
+          <w:p>
+            <w:pPr>
+              <w:pStyle w:val="Sinespaciado"/>
+            </w:pPr>
+            <w:r>
+              <w:t xml:space="preserve">Adicional a los tipos de documentos capturados en la Solicitud: registros proveedor tipo KR, KA, RC, RE. Favor de incluir </w:t>
+            </w:r>
+            <w:proofErr w:type="gramStart"/>
+            <w:r>
+              <w:t>los tipo</w:t>
+            </w:r>
+            <w:proofErr w:type="gramEnd"/>
+            <w:r>
+              <w:t xml:space="preserve"> KE NC (igual registros proveedor)</w:t>
+            </w:r>
           </w:p>
         </w:tc>
       </w:tr>
@@ -765,6 +901,7 @@
                 <w:sz w:val="28"/>
                 <w:szCs w:val="28"/>
               </w:rPr>
+              <w:lastRenderedPageBreak/>
               <w:t>Documentación de los cambios (</w:t>
             </w:r>
             <w:r>
@@ -906,9 +1043,115 @@
               <w:jc w:val="both"/>
               <w:textAlignment w:val="baseline"/>
               <w:rPr>
-                <w:b/>
-              </w:rPr>
-            </w:pPr>
+                <w:rFonts w:ascii="Calibri" w:eastAsia="Calibri" w:hAnsi="Calibri"/>
+                <w:sz w:val="22"/>
+                <w:szCs w:val="22"/>
+                <w:lang w:eastAsia="en-US"/>
+              </w:rPr>
+            </w:pPr>
+            <w:r>
+              <w:rPr>
+                <w:rFonts w:ascii="Calibri" w:eastAsia="Calibri" w:hAnsi="Calibri"/>
+                <w:sz w:val="22"/>
+                <w:szCs w:val="22"/>
+                <w:lang w:eastAsia="en-US"/>
+              </w:rPr>
+              <w:t xml:space="preserve">Se han creado 2 programas para realizar el trabajo. Programa de carga y programa que muestra el </w:t>
+            </w:r>
+            <w:proofErr w:type="spellStart"/>
+            <w:r>
+              <w:rPr>
+                <w:rFonts w:ascii="Calibri" w:eastAsia="Calibri" w:hAnsi="Calibri"/>
+                <w:sz w:val="22"/>
+                <w:szCs w:val="22"/>
+                <w:lang w:eastAsia="en-US"/>
+              </w:rPr>
+              <w:t>dashboard</w:t>
+            </w:r>
+            <w:proofErr w:type="spellEnd"/>
+            <w:r>
+              <w:rPr>
+                <w:rFonts w:ascii="Calibri" w:eastAsia="Calibri" w:hAnsi="Calibri"/>
+                <w:sz w:val="22"/>
+                <w:szCs w:val="22"/>
+                <w:lang w:eastAsia="en-US"/>
+              </w:rPr>
+              <w:t>. Adjunto diseño técnico y funcional</w:t>
+            </w:r>
+            <w:r>
+              <w:rPr>
+                <w:rFonts w:ascii="Calibri" w:eastAsia="Calibri" w:hAnsi="Calibri"/>
+                <w:sz w:val="22"/>
+                <w:szCs w:val="22"/>
+                <w:lang w:eastAsia="en-US"/>
+              </w:rPr>
+              <w:t>.</w:t>
+            </w:r>
+          </w:p>
+          <w:p>
+            <w:pPr>
+              <w:pStyle w:val="paragraph"/>
+              <w:spacing w:before="0" w:beforeAutospacing="0" w:after="0" w:afterAutospacing="0"/>
+              <w:jc w:val="both"/>
+              <w:textAlignment w:val="baseline"/>
+              <w:rPr>
+                <w:rFonts w:ascii="Calibri" w:eastAsia="Calibri" w:hAnsi="Calibri"/>
+                <w:sz w:val="22"/>
+                <w:szCs w:val="22"/>
+                <w:lang w:eastAsia="en-US"/>
+              </w:rPr>
+            </w:pPr>
+          </w:p>
+          <w:p>
+            <w:pPr>
+              <w:pStyle w:val="paragraph"/>
+              <w:spacing w:before="0" w:beforeAutospacing="0" w:after="0" w:afterAutospacing="0"/>
+              <w:jc w:val="both"/>
+              <w:textAlignment w:val="baseline"/>
+              <w:rPr>
+                <w:rFonts w:ascii="Calibri" w:eastAsia="Calibri" w:hAnsi="Calibri"/>
+                <w:sz w:val="22"/>
+                <w:szCs w:val="22"/>
+                <w:lang w:eastAsia="en-US"/>
+              </w:rPr>
+            </w:pPr>
+            <w:r>
+              <w:rPr>
+                <w:rFonts w:ascii="Calibri" w:eastAsia="Calibri" w:hAnsi="Calibri"/>
+                <w:sz w:val="22"/>
+                <w:szCs w:val="22"/>
+                <w:lang w:eastAsia="en-US"/>
+              </w:rPr>
+              <w:object w:dxaOrig="1520" w:dyaOrig="990" w14:anchorId="7A812546">
+                <v:shapetype id="_x0000_t75" coordsize="21600,21600" o:spt="75" o:preferrelative="t" path="m@4@5l@4@11@9@11@9@5xe" filled="f" stroked="f">
+                  <v:stroke joinstyle="miter"/>
+                  <v:formulas>
+                    <v:f eqn="if lineDrawn pixelLineWidth 0"/>
+                    <v:f eqn="sum @0 1 0"/>
+                    <v:f eqn="sum 0 0 @1"/>
+                    <v:f eqn="prod @2 1 2"/>
+                    <v:f eqn="prod @3 21600 pixelWidth"/>
+                    <v:f eqn="prod @3 21600 pixelHeight"/>
+                    <v:f eqn="sum @0 0 1"/>
+                    <v:f eqn="prod @6 1 2"/>
+                    <v:f eqn="prod @7 21600 pixelWidth"/>
+                    <v:f eqn="sum @8 21600 0"/>
+                    <v:f eqn="prod @7 21600 pixelHeight"/>
+                    <v:f eqn="sum @10 21600 0"/>
+                  </v:formulas>
+                  <v:path o:extrusionok="f" gradientshapeok="t" o:connecttype="rect"/>
+                  <o:lock v:ext="edit" aspectratio="t"/>
+                </v:shapetype>
+                <v:shape id="_x0000_i1027" type="#_x0000_t75" style="width:76.2pt;height:49.8pt" o:ole="">
+                  <v:imagedata r:id="rId12" o:title=""/>
+                </v:shape>
+                <o:OLEObject Type="Link" ProgID="Word.Document.12" ShapeID="_x0000_i1027" DrawAspect="Icon" r:id="rId13" UpdateMode="Always">
+                  <o:LinkType>EnhancedMetaFile</o:LinkType>
+                  <o:LockedField>false</o:LockedField>
+                  <o:FieldCodes>\f 0</o:FieldCodes>
+                </o:OLEObject>
+              </w:object>
+            </w:r>
           </w:p>
           <w:p>
             <w:pPr>
@@ -1103,7 +1346,7 @@
           </w:p>
           <w:tbl>
             <w:tblPr>
-              <w:tblW w:w="7798" w:type="dxa"/>
+              <w:tblW w:w="5938" w:type="dxa"/>
               <w:tblCellMar>
                 <w:left w:w="70" w:type="dxa"/>
                 <w:right w:w="70" w:type="dxa"/>
@@ -1111,23 +1354,23 @@
               <w:tblLook w:val="04A0" w:firstRow="1" w:lastRow="0" w:firstColumn="1" w:lastColumn="0" w:noHBand="0" w:noVBand="1"/>
             </w:tblPr>
             <w:tblGrid>
-              <w:gridCol w:w="1278"/>
-              <w:gridCol w:w="6520"/>
+              <w:gridCol w:w="1740"/>
+              <w:gridCol w:w="4198"/>
             </w:tblGrid>
             <w:tr>
               <w:trPr>
-                <w:trHeight w:val="315"/>
+                <w:trHeight w:val="648"/>
               </w:trPr>
               <w:tc>
                 <w:tcPr>
-                  <w:tcW w:w="1278" w:type="dxa"/>
+                  <w:tcW w:w="1740" w:type="dxa"/>
                   <w:tcBorders>
                     <w:top w:val="single" w:sz="8" w:space="0" w:color="auto"/>
                     <w:left w:val="single" w:sz="8" w:space="0" w:color="auto"/>
-                    <w:bottom w:val="single" w:sz="8" w:space="0" w:color="auto"/>
+                    <w:bottom w:val="single" w:sz="4" w:space="0" w:color="auto"/>
                     <w:right w:val="single" w:sz="4" w:space="0" w:color="auto"/>
                   </w:tcBorders>
-                  <w:shd w:val="clear" w:color="000000" w:fill="002060"/>
+                  <w:shd w:val="clear" w:color="000000" w:fill="153D64"/>
                   <w:noWrap/>
                   <w:vAlign w:val="center"/>
                   <w:hideMark/>
@@ -1135,9 +1378,10 @@
                 <w:p>
                   <w:pPr>
                     <w:framePr w:hSpace="141" w:wrap="around" w:vAnchor="text" w:hAnchor="text" w:y="-628"/>
+                    <w:spacing w:after="0" w:line="240" w:lineRule="auto"/>
                     <w:jc w:val="center"/>
                     <w:rPr>
-                      <w:rFonts w:cs="Calibri"/>
+                      <w:rFonts w:ascii="Aptos Narrow" w:eastAsia="Times New Roman" w:hAnsi="Aptos Narrow"/>
                       <w:b/>
                       <w:bCs/>
                       <w:color w:val="FFFFFF"/>
@@ -1146,7 +1390,7 @@
                   </w:pPr>
                   <w:r>
                     <w:rPr>
-                      <w:rFonts w:cs="Calibri"/>
+                      <w:rFonts w:ascii="Aptos Narrow" w:eastAsia="Times New Roman" w:hAnsi="Aptos Narrow"/>
                       <w:b/>
                       <w:bCs/>
                       <w:color w:val="FFFFFF"/>
@@ -1158,14 +1402,14 @@
               </w:tc>
               <w:tc>
                 <w:tcPr>
-                  <w:tcW w:w="6520" w:type="dxa"/>
+                  <w:tcW w:w="4198" w:type="dxa"/>
                   <w:tcBorders>
                     <w:top w:val="single" w:sz="8" w:space="0" w:color="auto"/>
                     <w:left w:val="nil"/>
-                    <w:bottom w:val="single" w:sz="8" w:space="0" w:color="auto"/>
-                    <w:right w:val="single" w:sz="8" w:space="0" w:color="auto"/>
+                    <w:bottom w:val="single" w:sz="4" w:space="0" w:color="auto"/>
+                    <w:right w:val="single" w:sz="8" w:space="0" w:color="000000"/>
                   </w:tcBorders>
-                  <w:shd w:val="clear" w:color="000000" w:fill="002060"/>
+                  <w:shd w:val="clear" w:color="000000" w:fill="153D64"/>
                   <w:noWrap/>
                   <w:vAlign w:val="center"/>
                   <w:hideMark/>
@@ -1173,37 +1417,36 @@
                 <w:p>
                   <w:pPr>
                     <w:framePr w:hSpace="141" w:wrap="around" w:vAnchor="text" w:hAnchor="text" w:y="-628"/>
+                    <w:spacing w:after="0" w:line="240" w:lineRule="auto"/>
                     <w:jc w:val="center"/>
                     <w:rPr>
-                      <w:rFonts w:cs="Calibri"/>
+                      <w:rFonts w:ascii="Aptos Narrow" w:eastAsia="Times New Roman" w:hAnsi="Aptos Narrow"/>
                       <w:b/>
                       <w:bCs/>
                       <w:color w:val="FFFFFF"/>
                       <w:lang w:eastAsia="es-ES"/>
                     </w:rPr>
                   </w:pPr>
-                  <w:proofErr w:type="spellStart"/>
                   <w:r>
                     <w:rPr>
-                      <w:rFonts w:cs="Calibri"/>
+                      <w:rFonts w:ascii="Aptos Narrow" w:eastAsia="Times New Roman" w:hAnsi="Aptos Narrow"/>
                       <w:b/>
                       <w:bCs/>
                       <w:color w:val="FFFFFF"/>
                       <w:lang w:eastAsia="es-ES"/>
                     </w:rPr>
-                    <w:t>Descripcion</w:t>
+                    <w:t>Descripción</w:t>
                   </w:r>
-                  <w:proofErr w:type="spellEnd"/>
                 </w:p>
               </w:tc>
             </w:tr>
             <w:tr>
               <w:trPr>
-                <w:trHeight w:val="300"/>
+                <w:trHeight w:val="444"/>
               </w:trPr>
               <w:tc>
                 <w:tcPr>
-                  <w:tcW w:w="1278" w:type="dxa"/>
+                  <w:tcW w:w="1740" w:type="dxa"/>
                   <w:tcBorders>
                     <w:top w:val="nil"/>
                     <w:left w:val="single" w:sz="8" w:space="0" w:color="auto"/>
@@ -1211,68 +1454,72 @@
                     <w:right w:val="single" w:sz="4" w:space="0" w:color="auto"/>
                   </w:tcBorders>
                   <w:noWrap/>
-                  <w:vAlign w:val="bottom"/>
+                  <w:vAlign w:val="center"/>
                   <w:hideMark/>
                 </w:tcPr>
                 <w:p>
                   <w:pPr>
                     <w:framePr w:hSpace="141" w:wrap="around" w:vAnchor="text" w:hAnchor="text" w:y="-628"/>
+                    <w:spacing w:after="0" w:line="240" w:lineRule="auto"/>
+                    <w:jc w:val="center"/>
                     <w:rPr>
-                      <w:rFonts w:cs="Calibri"/>
+                      <w:rFonts w:ascii="Aptos Narrow" w:eastAsia="Times New Roman" w:hAnsi="Aptos Narrow"/>
                       <w:color w:val="000000"/>
                       <w:lang w:eastAsia="es-ES"/>
                     </w:rPr>
                   </w:pPr>
                   <w:r>
                     <w:rPr>
-                      <w:rFonts w:cs="Calibri"/>
+                      <w:rFonts w:ascii="Aptos Narrow" w:eastAsia="Times New Roman" w:hAnsi="Aptos Narrow"/>
                       <w:color w:val="000000"/>
                       <w:lang w:eastAsia="es-ES"/>
                     </w:rPr>
-                    <w:t>ED2K981051</w:t>
+                    <w:t>ED2K9A0PVN</w:t>
                   </w:r>
                 </w:p>
               </w:tc>
               <w:tc>
                 <w:tcPr>
-                  <w:tcW w:w="6520" w:type="dxa"/>
+                  <w:tcW w:w="4198" w:type="dxa"/>
                   <w:tcBorders>
-                    <w:top w:val="nil"/>
+                    <w:top w:val="single" w:sz="4" w:space="0" w:color="auto"/>
                     <w:left w:val="nil"/>
                     <w:bottom w:val="single" w:sz="4" w:space="0" w:color="auto"/>
-                    <w:right w:val="single" w:sz="8" w:space="0" w:color="auto"/>
+                    <w:right w:val="single" w:sz="8" w:space="0" w:color="000000"/>
                   </w:tcBorders>
                   <w:noWrap/>
-                  <w:vAlign w:val="bottom"/>
+                  <w:vAlign w:val="center"/>
                   <w:hideMark/>
                 </w:tcPr>
                 <w:p>
                   <w:pPr>
                     <w:framePr w:hSpace="141" w:wrap="around" w:vAnchor="text" w:hAnchor="text" w:y="-628"/>
+                    <w:spacing w:after="0" w:line="240" w:lineRule="auto"/>
+                    <w:jc w:val="center"/>
                     <w:rPr>
-                      <w:rFonts w:cs="Calibri"/>
+                      <w:rFonts w:ascii="Aptos Narrow" w:eastAsia="Times New Roman" w:hAnsi="Aptos Narrow"/>
                       <w:color w:val="000000"/>
                       <w:lang w:eastAsia="es-ES"/>
                     </w:rPr>
                   </w:pPr>
                   <w:r>
                     <w:rPr>
-                      <w:rFonts w:cs="Calibri"/>
+                      <w:rFonts w:ascii="Aptos Narrow" w:eastAsia="Times New Roman" w:hAnsi="Aptos Narrow"/>
                       <w:color w:val="000000"/>
                       <w:lang w:eastAsia="es-ES"/>
                     </w:rPr>
-                    <w:t xml:space="preserve"> TODO-TR-SCTASK1149689 Permisos carga extractos</w:t>
+                    <w:t>TODO-GL-SCTASK2358770: Carga UUID México</w:t>
                   </w:r>
                 </w:p>
               </w:tc>
             </w:tr>
             <w:tr>
               <w:trPr>
-                <w:trHeight w:val="300"/>
+                <w:trHeight w:val="444"/>
               </w:trPr>
               <w:tc>
                 <w:tcPr>
-                  <w:tcW w:w="1278" w:type="dxa"/>
+                  <w:tcW w:w="1740" w:type="dxa"/>
                   <w:tcBorders>
                     <w:top w:val="nil"/>
                     <w:left w:val="single" w:sz="8" w:space="0" w:color="auto"/>
@@ -1280,68 +1527,72 @@
                     <w:right w:val="single" w:sz="4" w:space="0" w:color="auto"/>
                   </w:tcBorders>
                   <w:noWrap/>
-                  <w:vAlign w:val="bottom"/>
+                  <w:vAlign w:val="center"/>
                   <w:hideMark/>
                 </w:tcPr>
                 <w:p>
                   <w:pPr>
                     <w:framePr w:hSpace="141" w:wrap="around" w:vAnchor="text" w:hAnchor="text" w:y="-628"/>
+                    <w:spacing w:after="0" w:line="240" w:lineRule="auto"/>
+                    <w:jc w:val="center"/>
                     <w:rPr>
-                      <w:rFonts w:cs="Calibri"/>
+                      <w:rFonts w:ascii="Aptos Narrow" w:eastAsia="Times New Roman" w:hAnsi="Aptos Narrow"/>
                       <w:color w:val="000000"/>
                       <w:lang w:eastAsia="es-ES"/>
                     </w:rPr>
                   </w:pPr>
                   <w:r>
                     <w:rPr>
-                      <w:rFonts w:cs="Calibri"/>
+                      <w:rFonts w:ascii="Aptos Narrow" w:eastAsia="Times New Roman" w:hAnsi="Aptos Narrow"/>
                       <w:color w:val="000000"/>
                       <w:lang w:eastAsia="es-ES"/>
                     </w:rPr>
-                    <w:t>ED2K981114</w:t>
+                    <w:t>ED2K9A0PWO</w:t>
                   </w:r>
                 </w:p>
               </w:tc>
               <w:tc>
                 <w:tcPr>
-                  <w:tcW w:w="6520" w:type="dxa"/>
+                  <w:tcW w:w="4198" w:type="dxa"/>
                   <w:tcBorders>
-                    <w:top w:val="nil"/>
+                    <w:top w:val="single" w:sz="4" w:space="0" w:color="auto"/>
                     <w:left w:val="nil"/>
                     <w:bottom w:val="single" w:sz="4" w:space="0" w:color="auto"/>
-                    <w:right w:val="single" w:sz="8" w:space="0" w:color="auto"/>
+                    <w:right w:val="single" w:sz="8" w:space="0" w:color="000000"/>
                   </w:tcBorders>
                   <w:noWrap/>
-                  <w:vAlign w:val="bottom"/>
+                  <w:vAlign w:val="center"/>
                   <w:hideMark/>
                 </w:tcPr>
                 <w:p>
                   <w:pPr>
                     <w:framePr w:hSpace="141" w:wrap="around" w:vAnchor="text" w:hAnchor="text" w:y="-628"/>
+                    <w:spacing w:after="0" w:line="240" w:lineRule="auto"/>
+                    <w:jc w:val="center"/>
                     <w:rPr>
-                      <w:rFonts w:cs="Calibri"/>
+                      <w:rFonts w:ascii="Aptos Narrow" w:eastAsia="Times New Roman" w:hAnsi="Aptos Narrow"/>
                       <w:color w:val="000000"/>
                       <w:lang w:eastAsia="es-ES"/>
                     </w:rPr>
                   </w:pPr>
                   <w:r>
                     <w:rPr>
-                      <w:rFonts w:cs="Calibri"/>
+                      <w:rFonts w:ascii="Aptos Narrow" w:eastAsia="Times New Roman" w:hAnsi="Aptos Narrow"/>
                       <w:color w:val="000000"/>
                       <w:lang w:eastAsia="es-ES"/>
                     </w:rPr>
-                    <w:t xml:space="preserve"> TODO-TR-SCTASK1149689 Permisos carga extractos</w:t>
+                    <w:t>TODO-GL-SCTASK2358770: Carga UUID México</w:t>
                   </w:r>
                 </w:p>
               </w:tc>
             </w:tr>
             <w:tr>
               <w:trPr>
-                <w:trHeight w:val="300"/>
+                <w:trHeight w:val="444"/>
               </w:trPr>
               <w:tc>
                 <w:tcPr>
-                  <w:tcW w:w="1278" w:type="dxa"/>
+                  <w:tcW w:w="1740" w:type="dxa"/>
                   <w:tcBorders>
                     <w:top w:val="nil"/>
                     <w:left w:val="single" w:sz="8" w:space="0" w:color="auto"/>
@@ -1349,68 +1600,72 @@
                     <w:right w:val="single" w:sz="4" w:space="0" w:color="auto"/>
                   </w:tcBorders>
                   <w:noWrap/>
-                  <w:vAlign w:val="bottom"/>
+                  <w:vAlign w:val="center"/>
                   <w:hideMark/>
                 </w:tcPr>
                 <w:p>
                   <w:pPr>
                     <w:framePr w:hSpace="141" w:wrap="around" w:vAnchor="text" w:hAnchor="text" w:y="-628"/>
+                    <w:spacing w:after="0" w:line="240" w:lineRule="auto"/>
+                    <w:jc w:val="center"/>
                     <w:rPr>
-                      <w:rFonts w:cs="Calibri"/>
+                      <w:rFonts w:ascii="Aptos Narrow" w:eastAsia="Times New Roman" w:hAnsi="Aptos Narrow"/>
                       <w:color w:val="000000"/>
                       <w:lang w:eastAsia="es-ES"/>
                     </w:rPr>
                   </w:pPr>
                   <w:r>
                     <w:rPr>
-                      <w:rFonts w:cs="Calibri"/>
+                      <w:rFonts w:ascii="Aptos Narrow" w:eastAsia="Times New Roman" w:hAnsi="Aptos Narrow"/>
                       <w:color w:val="000000"/>
                       <w:lang w:eastAsia="es-ES"/>
                     </w:rPr>
-                    <w:t>ED2K981641</w:t>
+                    <w:t>ED2K9A0PX0</w:t>
                   </w:r>
                 </w:p>
               </w:tc>
               <w:tc>
                 <w:tcPr>
-                  <w:tcW w:w="6520" w:type="dxa"/>
+                  <w:tcW w:w="4198" w:type="dxa"/>
                   <w:tcBorders>
-                    <w:top w:val="nil"/>
+                    <w:top w:val="single" w:sz="4" w:space="0" w:color="auto"/>
                     <w:left w:val="nil"/>
                     <w:bottom w:val="single" w:sz="4" w:space="0" w:color="auto"/>
-                    <w:right w:val="single" w:sz="8" w:space="0" w:color="auto"/>
+                    <w:right w:val="single" w:sz="8" w:space="0" w:color="000000"/>
                   </w:tcBorders>
                   <w:noWrap/>
-                  <w:vAlign w:val="bottom"/>
+                  <w:vAlign w:val="center"/>
                   <w:hideMark/>
                 </w:tcPr>
                 <w:p>
                   <w:pPr>
                     <w:framePr w:hSpace="141" w:wrap="around" w:vAnchor="text" w:hAnchor="text" w:y="-628"/>
+                    <w:spacing w:after="0" w:line="240" w:lineRule="auto"/>
+                    <w:jc w:val="center"/>
                     <w:rPr>
-                      <w:rFonts w:cs="Calibri"/>
+                      <w:rFonts w:ascii="Aptos Narrow" w:eastAsia="Times New Roman" w:hAnsi="Aptos Narrow"/>
                       <w:color w:val="000000"/>
                       <w:lang w:eastAsia="es-ES"/>
                     </w:rPr>
                   </w:pPr>
                   <w:r>
                     <w:rPr>
-                      <w:rFonts w:cs="Calibri"/>
+                      <w:rFonts w:ascii="Aptos Narrow" w:eastAsia="Times New Roman" w:hAnsi="Aptos Narrow"/>
                       <w:color w:val="000000"/>
                       <w:lang w:eastAsia="es-ES"/>
                     </w:rPr>
-                    <w:t xml:space="preserve"> TODO-TR-SCTASK1149689 Permisos carga extractos</w:t>
+                    <w:t>TODO-GL-SCTASK2358770: Carga UUID México</w:t>
                   </w:r>
                 </w:p>
               </w:tc>
             </w:tr>
             <w:tr>
               <w:trPr>
-                <w:trHeight w:val="300"/>
+                <w:trHeight w:val="444"/>
               </w:trPr>
               <w:tc>
                 <w:tcPr>
-                  <w:tcW w:w="1278" w:type="dxa"/>
+                  <w:tcW w:w="1740" w:type="dxa"/>
                   <w:tcBorders>
                     <w:top w:val="nil"/>
                     <w:left w:val="single" w:sz="8" w:space="0" w:color="auto"/>
@@ -1418,68 +1673,72 @@
                     <w:right w:val="single" w:sz="4" w:space="0" w:color="auto"/>
                   </w:tcBorders>
                   <w:noWrap/>
-                  <w:vAlign w:val="bottom"/>
+                  <w:vAlign w:val="center"/>
                   <w:hideMark/>
                 </w:tcPr>
                 <w:p>
                   <w:pPr>
                     <w:framePr w:hSpace="141" w:wrap="around" w:vAnchor="text" w:hAnchor="text" w:y="-628"/>
+                    <w:spacing w:after="0" w:line="240" w:lineRule="auto"/>
+                    <w:jc w:val="center"/>
                     <w:rPr>
-                      <w:rFonts w:cs="Calibri"/>
+                      <w:rFonts w:ascii="Aptos Narrow" w:eastAsia="Times New Roman" w:hAnsi="Aptos Narrow"/>
                       <w:color w:val="000000"/>
                       <w:lang w:eastAsia="es-ES"/>
                     </w:rPr>
                   </w:pPr>
                   <w:r>
                     <w:rPr>
-                      <w:rFonts w:cs="Calibri"/>
+                      <w:rFonts w:ascii="Aptos Narrow" w:eastAsia="Times New Roman" w:hAnsi="Aptos Narrow"/>
                       <w:color w:val="000000"/>
                       <w:lang w:eastAsia="es-ES"/>
                     </w:rPr>
-                    <w:t>ED2K981653</w:t>
+                    <w:t>ED2K9A0PY5</w:t>
                   </w:r>
                 </w:p>
               </w:tc>
               <w:tc>
                 <w:tcPr>
-                  <w:tcW w:w="6520" w:type="dxa"/>
+                  <w:tcW w:w="4198" w:type="dxa"/>
                   <w:tcBorders>
-                    <w:top w:val="nil"/>
+                    <w:top w:val="single" w:sz="4" w:space="0" w:color="auto"/>
                     <w:left w:val="nil"/>
                     <w:bottom w:val="single" w:sz="4" w:space="0" w:color="auto"/>
-                    <w:right w:val="single" w:sz="8" w:space="0" w:color="auto"/>
+                    <w:right w:val="single" w:sz="8" w:space="0" w:color="000000"/>
                   </w:tcBorders>
                   <w:noWrap/>
-                  <w:vAlign w:val="bottom"/>
+                  <w:vAlign w:val="center"/>
                   <w:hideMark/>
                 </w:tcPr>
                 <w:p>
                   <w:pPr>
                     <w:framePr w:hSpace="141" w:wrap="around" w:vAnchor="text" w:hAnchor="text" w:y="-628"/>
+                    <w:spacing w:after="0" w:line="240" w:lineRule="auto"/>
+                    <w:jc w:val="center"/>
                     <w:rPr>
-                      <w:rFonts w:cs="Calibri"/>
+                      <w:rFonts w:ascii="Aptos Narrow" w:eastAsia="Times New Roman" w:hAnsi="Aptos Narrow"/>
                       <w:color w:val="000000"/>
                       <w:lang w:eastAsia="es-ES"/>
                     </w:rPr>
                   </w:pPr>
                   <w:r>
                     <w:rPr>
-                      <w:rFonts w:cs="Calibri"/>
+                      <w:rFonts w:ascii="Aptos Narrow" w:eastAsia="Times New Roman" w:hAnsi="Aptos Narrow"/>
                       <w:color w:val="000000"/>
                       <w:lang w:eastAsia="es-ES"/>
                     </w:rPr>
-                    <w:t xml:space="preserve"> TODO-TR-SCTASK1149689 Permisos carga extractos</w:t>
+                    <w:t>TODO-GL-SCTASK2358770: Carga UUID México</w:t>
                   </w:r>
                 </w:p>
               </w:tc>
             </w:tr>
             <w:tr>
               <w:trPr>
-                <w:trHeight w:val="300"/>
+                <w:trHeight w:val="444"/>
               </w:trPr>
               <w:tc>
                 <w:tcPr>
-                  <w:tcW w:w="1278" w:type="dxa"/>
+                  <w:tcW w:w="1740" w:type="dxa"/>
                   <w:tcBorders>
                     <w:top w:val="nil"/>
                     <w:left w:val="single" w:sz="8" w:space="0" w:color="auto"/>
@@ -1487,68 +1746,729 @@
                     <w:right w:val="single" w:sz="4" w:space="0" w:color="auto"/>
                   </w:tcBorders>
                   <w:noWrap/>
-                  <w:vAlign w:val="bottom"/>
+                  <w:vAlign w:val="center"/>
                   <w:hideMark/>
                 </w:tcPr>
                 <w:p>
                   <w:pPr>
                     <w:framePr w:hSpace="141" w:wrap="around" w:vAnchor="text" w:hAnchor="text" w:y="-628"/>
+                    <w:spacing w:after="0" w:line="240" w:lineRule="auto"/>
+                    <w:jc w:val="center"/>
                     <w:rPr>
-                      <w:rFonts w:cs="Calibri"/>
+                      <w:rFonts w:ascii="Aptos Narrow" w:eastAsia="Times New Roman" w:hAnsi="Aptos Narrow"/>
                       <w:color w:val="000000"/>
                       <w:lang w:eastAsia="es-ES"/>
                     </w:rPr>
                   </w:pPr>
                   <w:r>
                     <w:rPr>
-                      <w:rFonts w:cs="Calibri"/>
+                      <w:rFonts w:ascii="Aptos Narrow" w:eastAsia="Times New Roman" w:hAnsi="Aptos Narrow"/>
                       <w:color w:val="000000"/>
                       <w:lang w:eastAsia="es-ES"/>
                     </w:rPr>
-                    <w:t>ED2K981769</w:t>
+                    <w:t>ED2K9A0PY9</w:t>
                   </w:r>
                 </w:p>
               </w:tc>
               <w:tc>
                 <w:tcPr>
-                  <w:tcW w:w="6520" w:type="dxa"/>
+                  <w:tcW w:w="4198" w:type="dxa"/>
                   <w:tcBorders>
-                    <w:top w:val="nil"/>
+                    <w:top w:val="single" w:sz="4" w:space="0" w:color="auto"/>
                     <w:left w:val="nil"/>
                     <w:bottom w:val="single" w:sz="4" w:space="0" w:color="auto"/>
-                    <w:right w:val="single" w:sz="8" w:space="0" w:color="auto"/>
+                    <w:right w:val="single" w:sz="8" w:space="0" w:color="000000"/>
                   </w:tcBorders>
                   <w:noWrap/>
-                  <w:vAlign w:val="bottom"/>
+                  <w:vAlign w:val="center"/>
                   <w:hideMark/>
                 </w:tcPr>
                 <w:p>
                   <w:pPr>
                     <w:framePr w:hSpace="141" w:wrap="around" w:vAnchor="text" w:hAnchor="text" w:y="-628"/>
+                    <w:spacing w:after="0" w:line="240" w:lineRule="auto"/>
+                    <w:jc w:val="center"/>
                     <w:rPr>
-                      <w:rFonts w:cs="Calibri"/>
+                      <w:rFonts w:ascii="Aptos Narrow" w:eastAsia="Times New Roman" w:hAnsi="Aptos Narrow"/>
                       <w:color w:val="000000"/>
                       <w:lang w:eastAsia="es-ES"/>
                     </w:rPr>
                   </w:pPr>
                   <w:r>
                     <w:rPr>
-                      <w:rFonts w:cs="Calibri"/>
+                      <w:rFonts w:ascii="Aptos Narrow" w:eastAsia="Times New Roman" w:hAnsi="Aptos Narrow"/>
                       <w:color w:val="000000"/>
                       <w:lang w:eastAsia="es-ES"/>
                     </w:rPr>
-                    <w:t xml:space="preserve"> TODO-TR-SCTASK1149689 Permisos carga extractos</w:t>
+                    <w:t>TODO-GL-SCTASK2358770: Carga UUID México</w:t>
                   </w:r>
                 </w:p>
               </w:tc>
             </w:tr>
             <w:tr>
               <w:trPr>
-                <w:trHeight w:val="315"/>
+                <w:trHeight w:val="444"/>
               </w:trPr>
               <w:tc>
                 <w:tcPr>
-                  <w:tcW w:w="1278" w:type="dxa"/>
+                  <w:tcW w:w="1740" w:type="dxa"/>
+                  <w:tcBorders>
+                    <w:top w:val="nil"/>
+                    <w:left w:val="single" w:sz="8" w:space="0" w:color="auto"/>
+                    <w:bottom w:val="single" w:sz="4" w:space="0" w:color="auto"/>
+                    <w:right w:val="single" w:sz="4" w:space="0" w:color="auto"/>
+                  </w:tcBorders>
+                  <w:noWrap/>
+                  <w:vAlign w:val="center"/>
+                  <w:hideMark/>
+                </w:tcPr>
+                <w:p>
+                  <w:pPr>
+                    <w:framePr w:hSpace="141" w:wrap="around" w:vAnchor="text" w:hAnchor="text" w:y="-628"/>
+                    <w:spacing w:after="0" w:line="240" w:lineRule="auto"/>
+                    <w:jc w:val="center"/>
+                    <w:rPr>
+                      <w:rFonts w:ascii="Aptos Narrow" w:eastAsia="Times New Roman" w:hAnsi="Aptos Narrow"/>
+                      <w:color w:val="000000"/>
+                      <w:lang w:eastAsia="es-ES"/>
+                    </w:rPr>
+                  </w:pPr>
+                  <w:r>
+                    <w:rPr>
+                      <w:rFonts w:ascii="Aptos Narrow" w:eastAsia="Times New Roman" w:hAnsi="Aptos Narrow"/>
+                      <w:color w:val="000000"/>
+                      <w:lang w:eastAsia="es-ES"/>
+                    </w:rPr>
+                    <w:t>ED2K9A0PYM</w:t>
+                  </w:r>
+                </w:p>
+              </w:tc>
+              <w:tc>
+                <w:tcPr>
+                  <w:tcW w:w="4198" w:type="dxa"/>
+                  <w:tcBorders>
+                    <w:top w:val="single" w:sz="4" w:space="0" w:color="auto"/>
+                    <w:left w:val="nil"/>
+                    <w:bottom w:val="single" w:sz="4" w:space="0" w:color="auto"/>
+                    <w:right w:val="single" w:sz="8" w:space="0" w:color="000000"/>
+                  </w:tcBorders>
+                  <w:noWrap/>
+                  <w:vAlign w:val="center"/>
+                  <w:hideMark/>
+                </w:tcPr>
+                <w:p>
+                  <w:pPr>
+                    <w:framePr w:hSpace="141" w:wrap="around" w:vAnchor="text" w:hAnchor="text" w:y="-628"/>
+                    <w:spacing w:after="0" w:line="240" w:lineRule="auto"/>
+                    <w:jc w:val="center"/>
+                    <w:rPr>
+                      <w:rFonts w:ascii="Aptos Narrow" w:eastAsia="Times New Roman" w:hAnsi="Aptos Narrow"/>
+                      <w:color w:val="000000"/>
+                      <w:lang w:eastAsia="es-ES"/>
+                    </w:rPr>
+                  </w:pPr>
+                  <w:r>
+                    <w:rPr>
+                      <w:rFonts w:ascii="Aptos Narrow" w:eastAsia="Times New Roman" w:hAnsi="Aptos Narrow"/>
+                      <w:color w:val="000000"/>
+                      <w:lang w:eastAsia="es-ES"/>
+                    </w:rPr>
+                    <w:t>TODO-GL-SCTASK2358770: Carga UUID México</w:t>
+                  </w:r>
+                </w:p>
+              </w:tc>
+            </w:tr>
+            <w:tr>
+              <w:trPr>
+                <w:trHeight w:val="444"/>
+              </w:trPr>
+              <w:tc>
+                <w:tcPr>
+                  <w:tcW w:w="1740" w:type="dxa"/>
+                  <w:tcBorders>
+                    <w:top w:val="nil"/>
+                    <w:left w:val="single" w:sz="8" w:space="0" w:color="auto"/>
+                    <w:bottom w:val="single" w:sz="4" w:space="0" w:color="auto"/>
+                    <w:right w:val="single" w:sz="4" w:space="0" w:color="auto"/>
+                  </w:tcBorders>
+                  <w:noWrap/>
+                  <w:vAlign w:val="center"/>
+                  <w:hideMark/>
+                </w:tcPr>
+                <w:p>
+                  <w:pPr>
+                    <w:framePr w:hSpace="141" w:wrap="around" w:vAnchor="text" w:hAnchor="text" w:y="-628"/>
+                    <w:spacing w:after="0" w:line="240" w:lineRule="auto"/>
+                    <w:jc w:val="center"/>
+                    <w:rPr>
+                      <w:rFonts w:ascii="Aptos Narrow" w:eastAsia="Times New Roman" w:hAnsi="Aptos Narrow"/>
+                      <w:color w:val="000000"/>
+                      <w:lang w:eastAsia="es-ES"/>
+                    </w:rPr>
+                  </w:pPr>
+                  <w:r>
+                    <w:rPr>
+                      <w:rFonts w:ascii="Aptos Narrow" w:eastAsia="Times New Roman" w:hAnsi="Aptos Narrow"/>
+                      <w:color w:val="000000"/>
+                      <w:lang w:eastAsia="es-ES"/>
+                    </w:rPr>
+                    <w:t>ED2K9A0PZ2</w:t>
+                  </w:r>
+                </w:p>
+              </w:tc>
+              <w:tc>
+                <w:tcPr>
+                  <w:tcW w:w="4198" w:type="dxa"/>
+                  <w:tcBorders>
+                    <w:top w:val="single" w:sz="4" w:space="0" w:color="auto"/>
+                    <w:left w:val="nil"/>
+                    <w:bottom w:val="single" w:sz="4" w:space="0" w:color="auto"/>
+                    <w:right w:val="single" w:sz="8" w:space="0" w:color="000000"/>
+                  </w:tcBorders>
+                  <w:noWrap/>
+                  <w:vAlign w:val="center"/>
+                  <w:hideMark/>
+                </w:tcPr>
+                <w:p>
+                  <w:pPr>
+                    <w:framePr w:hSpace="141" w:wrap="around" w:vAnchor="text" w:hAnchor="text" w:y="-628"/>
+                    <w:spacing w:after="0" w:line="240" w:lineRule="auto"/>
+                    <w:jc w:val="center"/>
+                    <w:rPr>
+                      <w:rFonts w:ascii="Aptos Narrow" w:eastAsia="Times New Roman" w:hAnsi="Aptos Narrow"/>
+                      <w:color w:val="000000"/>
+                      <w:lang w:eastAsia="es-ES"/>
+                    </w:rPr>
+                  </w:pPr>
+                  <w:r>
+                    <w:rPr>
+                      <w:rFonts w:ascii="Aptos Narrow" w:eastAsia="Times New Roman" w:hAnsi="Aptos Narrow"/>
+                      <w:color w:val="000000"/>
+                      <w:lang w:eastAsia="es-ES"/>
+                    </w:rPr>
+                    <w:t>TODO-GL-SCTASK2358770: Carga UUID México</w:t>
+                  </w:r>
+                </w:p>
+              </w:tc>
+            </w:tr>
+            <w:tr>
+              <w:trPr>
+                <w:trHeight w:val="444"/>
+              </w:trPr>
+              <w:tc>
+                <w:tcPr>
+                  <w:tcW w:w="1740" w:type="dxa"/>
+                  <w:tcBorders>
+                    <w:top w:val="nil"/>
+                    <w:left w:val="single" w:sz="8" w:space="0" w:color="auto"/>
+                    <w:bottom w:val="single" w:sz="4" w:space="0" w:color="auto"/>
+                    <w:right w:val="single" w:sz="4" w:space="0" w:color="auto"/>
+                  </w:tcBorders>
+                  <w:noWrap/>
+                  <w:vAlign w:val="center"/>
+                  <w:hideMark/>
+                </w:tcPr>
+                <w:p>
+                  <w:pPr>
+                    <w:framePr w:hSpace="141" w:wrap="around" w:vAnchor="text" w:hAnchor="text" w:y="-628"/>
+                    <w:spacing w:after="0" w:line="240" w:lineRule="auto"/>
+                    <w:jc w:val="center"/>
+                    <w:rPr>
+                      <w:rFonts w:ascii="Aptos Narrow" w:eastAsia="Times New Roman" w:hAnsi="Aptos Narrow"/>
+                      <w:color w:val="000000"/>
+                      <w:lang w:eastAsia="es-ES"/>
+                    </w:rPr>
+                  </w:pPr>
+                  <w:r>
+                    <w:rPr>
+                      <w:rFonts w:ascii="Aptos Narrow" w:eastAsia="Times New Roman" w:hAnsi="Aptos Narrow"/>
+                      <w:color w:val="000000"/>
+                      <w:lang w:eastAsia="es-ES"/>
+                    </w:rPr>
+                    <w:t>ED2K9A0PZC</w:t>
+                  </w:r>
+                </w:p>
+              </w:tc>
+              <w:tc>
+                <w:tcPr>
+                  <w:tcW w:w="4198" w:type="dxa"/>
+                  <w:tcBorders>
+                    <w:top w:val="single" w:sz="4" w:space="0" w:color="auto"/>
+                    <w:left w:val="nil"/>
+                    <w:bottom w:val="single" w:sz="4" w:space="0" w:color="auto"/>
+                    <w:right w:val="single" w:sz="8" w:space="0" w:color="000000"/>
+                  </w:tcBorders>
+                  <w:noWrap/>
+                  <w:vAlign w:val="center"/>
+                  <w:hideMark/>
+                </w:tcPr>
+                <w:p>
+                  <w:pPr>
+                    <w:framePr w:hSpace="141" w:wrap="around" w:vAnchor="text" w:hAnchor="text" w:y="-628"/>
+                    <w:spacing w:after="0" w:line="240" w:lineRule="auto"/>
+                    <w:jc w:val="center"/>
+                    <w:rPr>
+                      <w:rFonts w:ascii="Aptos Narrow" w:eastAsia="Times New Roman" w:hAnsi="Aptos Narrow"/>
+                      <w:color w:val="000000"/>
+                      <w:lang w:eastAsia="es-ES"/>
+                    </w:rPr>
+                  </w:pPr>
+                  <w:r>
+                    <w:rPr>
+                      <w:rFonts w:ascii="Aptos Narrow" w:eastAsia="Times New Roman" w:hAnsi="Aptos Narrow"/>
+                      <w:color w:val="000000"/>
+                      <w:lang w:eastAsia="es-ES"/>
+                    </w:rPr>
+                    <w:t>TODO-GL-SCTASK2358770: Carga UUID México</w:t>
+                  </w:r>
+                </w:p>
+              </w:tc>
+            </w:tr>
+            <w:tr>
+              <w:trPr>
+                <w:trHeight w:val="444"/>
+              </w:trPr>
+              <w:tc>
+                <w:tcPr>
+                  <w:tcW w:w="1740" w:type="dxa"/>
+                  <w:tcBorders>
+                    <w:top w:val="nil"/>
+                    <w:left w:val="single" w:sz="8" w:space="0" w:color="auto"/>
+                    <w:bottom w:val="single" w:sz="4" w:space="0" w:color="auto"/>
+                    <w:right w:val="single" w:sz="4" w:space="0" w:color="auto"/>
+                  </w:tcBorders>
+                  <w:noWrap/>
+                  <w:vAlign w:val="center"/>
+                  <w:hideMark/>
+                </w:tcPr>
+                <w:p>
+                  <w:pPr>
+                    <w:framePr w:hSpace="141" w:wrap="around" w:vAnchor="text" w:hAnchor="text" w:y="-628"/>
+                    <w:spacing w:after="0" w:line="240" w:lineRule="auto"/>
+                    <w:jc w:val="center"/>
+                    <w:rPr>
+                      <w:rFonts w:ascii="Aptos Narrow" w:eastAsia="Times New Roman" w:hAnsi="Aptos Narrow"/>
+                      <w:color w:val="000000"/>
+                      <w:lang w:eastAsia="es-ES"/>
+                    </w:rPr>
+                  </w:pPr>
+                  <w:r>
+                    <w:rPr>
+                      <w:rFonts w:ascii="Aptos Narrow" w:eastAsia="Times New Roman" w:hAnsi="Aptos Narrow"/>
+                      <w:color w:val="000000"/>
+                      <w:lang w:eastAsia="es-ES"/>
+                    </w:rPr>
+                    <w:t>ED2K9A0Q03</w:t>
+                  </w:r>
+                </w:p>
+              </w:tc>
+              <w:tc>
+                <w:tcPr>
+                  <w:tcW w:w="4198" w:type="dxa"/>
+                  <w:tcBorders>
+                    <w:top w:val="single" w:sz="4" w:space="0" w:color="auto"/>
+                    <w:left w:val="nil"/>
+                    <w:bottom w:val="single" w:sz="4" w:space="0" w:color="auto"/>
+                    <w:right w:val="single" w:sz="8" w:space="0" w:color="000000"/>
+                  </w:tcBorders>
+                  <w:noWrap/>
+                  <w:vAlign w:val="center"/>
+                  <w:hideMark/>
+                </w:tcPr>
+                <w:p>
+                  <w:pPr>
+                    <w:framePr w:hSpace="141" w:wrap="around" w:vAnchor="text" w:hAnchor="text" w:y="-628"/>
+                    <w:spacing w:after="0" w:line="240" w:lineRule="auto"/>
+                    <w:jc w:val="center"/>
+                    <w:rPr>
+                      <w:rFonts w:ascii="Aptos Narrow" w:eastAsia="Times New Roman" w:hAnsi="Aptos Narrow"/>
+                      <w:color w:val="000000"/>
+                      <w:lang w:eastAsia="es-ES"/>
+                    </w:rPr>
+                  </w:pPr>
+                  <w:r>
+                    <w:rPr>
+                      <w:rFonts w:ascii="Aptos Narrow" w:eastAsia="Times New Roman" w:hAnsi="Aptos Narrow"/>
+                      <w:color w:val="000000"/>
+                      <w:lang w:eastAsia="es-ES"/>
+                    </w:rPr>
+                    <w:t>TODO-GL-SCTASK2358770: Carga UUID México</w:t>
+                  </w:r>
+                </w:p>
+              </w:tc>
+            </w:tr>
+            <w:tr>
+              <w:trPr>
+                <w:trHeight w:val="444"/>
+              </w:trPr>
+              <w:tc>
+                <w:tcPr>
+                  <w:tcW w:w="1740" w:type="dxa"/>
+                  <w:tcBorders>
+                    <w:top w:val="nil"/>
+                    <w:left w:val="single" w:sz="8" w:space="0" w:color="auto"/>
+                    <w:bottom w:val="single" w:sz="4" w:space="0" w:color="auto"/>
+                    <w:right w:val="single" w:sz="4" w:space="0" w:color="auto"/>
+                  </w:tcBorders>
+                  <w:noWrap/>
+                  <w:vAlign w:val="center"/>
+                  <w:hideMark/>
+                </w:tcPr>
+                <w:p>
+                  <w:pPr>
+                    <w:framePr w:hSpace="141" w:wrap="around" w:vAnchor="text" w:hAnchor="text" w:y="-628"/>
+                    <w:spacing w:after="0" w:line="240" w:lineRule="auto"/>
+                    <w:jc w:val="center"/>
+                    <w:rPr>
+                      <w:rFonts w:ascii="Aptos Narrow" w:eastAsia="Times New Roman" w:hAnsi="Aptos Narrow"/>
+                      <w:color w:val="000000"/>
+                      <w:lang w:eastAsia="es-ES"/>
+                    </w:rPr>
+                  </w:pPr>
+                  <w:r>
+                    <w:rPr>
+                      <w:rFonts w:ascii="Aptos Narrow" w:eastAsia="Times New Roman" w:hAnsi="Aptos Narrow"/>
+                      <w:color w:val="000000"/>
+                      <w:lang w:eastAsia="es-ES"/>
+                    </w:rPr>
+                    <w:t>ED2K9A0Q05</w:t>
+                  </w:r>
+                </w:p>
+              </w:tc>
+              <w:tc>
+                <w:tcPr>
+                  <w:tcW w:w="4198" w:type="dxa"/>
+                  <w:tcBorders>
+                    <w:top w:val="single" w:sz="4" w:space="0" w:color="auto"/>
+                    <w:left w:val="nil"/>
+                    <w:bottom w:val="single" w:sz="4" w:space="0" w:color="auto"/>
+                    <w:right w:val="single" w:sz="8" w:space="0" w:color="000000"/>
+                  </w:tcBorders>
+                  <w:noWrap/>
+                  <w:vAlign w:val="center"/>
+                  <w:hideMark/>
+                </w:tcPr>
+                <w:p>
+                  <w:pPr>
+                    <w:framePr w:hSpace="141" w:wrap="around" w:vAnchor="text" w:hAnchor="text" w:y="-628"/>
+                    <w:spacing w:after="0" w:line="240" w:lineRule="auto"/>
+                    <w:jc w:val="center"/>
+                    <w:rPr>
+                      <w:rFonts w:ascii="Aptos Narrow" w:eastAsia="Times New Roman" w:hAnsi="Aptos Narrow"/>
+                      <w:color w:val="000000"/>
+                      <w:lang w:eastAsia="es-ES"/>
+                    </w:rPr>
+                  </w:pPr>
+                  <w:r>
+                    <w:rPr>
+                      <w:rFonts w:ascii="Aptos Narrow" w:eastAsia="Times New Roman" w:hAnsi="Aptos Narrow"/>
+                      <w:color w:val="000000"/>
+                      <w:lang w:eastAsia="es-ES"/>
+                    </w:rPr>
+                    <w:t>TODO-GL-SCTASK2358770: Carga UUID México</w:t>
+                  </w:r>
+                </w:p>
+              </w:tc>
+            </w:tr>
+            <w:tr>
+              <w:trPr>
+                <w:trHeight w:val="444"/>
+              </w:trPr>
+              <w:tc>
+                <w:tcPr>
+                  <w:tcW w:w="1740" w:type="dxa"/>
+                  <w:tcBorders>
+                    <w:top w:val="nil"/>
+                    <w:left w:val="single" w:sz="8" w:space="0" w:color="auto"/>
+                    <w:bottom w:val="single" w:sz="4" w:space="0" w:color="auto"/>
+                    <w:right w:val="single" w:sz="4" w:space="0" w:color="auto"/>
+                  </w:tcBorders>
+                  <w:noWrap/>
+                  <w:vAlign w:val="center"/>
+                  <w:hideMark/>
+                </w:tcPr>
+                <w:p>
+                  <w:pPr>
+                    <w:framePr w:hSpace="141" w:wrap="around" w:vAnchor="text" w:hAnchor="text" w:y="-628"/>
+                    <w:spacing w:after="0" w:line="240" w:lineRule="auto"/>
+                    <w:jc w:val="center"/>
+                    <w:rPr>
+                      <w:rFonts w:ascii="Aptos Narrow" w:eastAsia="Times New Roman" w:hAnsi="Aptos Narrow"/>
+                      <w:color w:val="000000"/>
+                      <w:lang w:eastAsia="es-ES"/>
+                    </w:rPr>
+                  </w:pPr>
+                  <w:r>
+                    <w:rPr>
+                      <w:rFonts w:ascii="Aptos Narrow" w:eastAsia="Times New Roman" w:hAnsi="Aptos Narrow"/>
+                      <w:color w:val="000000"/>
+                      <w:lang w:eastAsia="es-ES"/>
+                    </w:rPr>
+                    <w:t>ED2K9A0Q0B</w:t>
+                  </w:r>
+                </w:p>
+              </w:tc>
+              <w:tc>
+                <w:tcPr>
+                  <w:tcW w:w="4198" w:type="dxa"/>
+                  <w:tcBorders>
+                    <w:top w:val="single" w:sz="4" w:space="0" w:color="auto"/>
+                    <w:left w:val="nil"/>
+                    <w:bottom w:val="single" w:sz="4" w:space="0" w:color="auto"/>
+                    <w:right w:val="single" w:sz="8" w:space="0" w:color="000000"/>
+                  </w:tcBorders>
+                  <w:noWrap/>
+                  <w:vAlign w:val="center"/>
+                  <w:hideMark/>
+                </w:tcPr>
+                <w:p>
+                  <w:pPr>
+                    <w:framePr w:hSpace="141" w:wrap="around" w:vAnchor="text" w:hAnchor="text" w:y="-628"/>
+                    <w:spacing w:after="0" w:line="240" w:lineRule="auto"/>
+                    <w:jc w:val="center"/>
+                    <w:rPr>
+                      <w:rFonts w:ascii="Aptos Narrow" w:eastAsia="Times New Roman" w:hAnsi="Aptos Narrow"/>
+                      <w:color w:val="000000"/>
+                      <w:lang w:eastAsia="es-ES"/>
+                    </w:rPr>
+                  </w:pPr>
+                  <w:r>
+                    <w:rPr>
+                      <w:rFonts w:ascii="Aptos Narrow" w:eastAsia="Times New Roman" w:hAnsi="Aptos Narrow"/>
+                      <w:color w:val="000000"/>
+                      <w:lang w:eastAsia="es-ES"/>
+                    </w:rPr>
+                    <w:t>TODO-GL-SCTASK2358770: Carga UUID México</w:t>
+                  </w:r>
+                </w:p>
+              </w:tc>
+            </w:tr>
+            <w:tr>
+              <w:trPr>
+                <w:trHeight w:val="444"/>
+              </w:trPr>
+              <w:tc>
+                <w:tcPr>
+                  <w:tcW w:w="1740" w:type="dxa"/>
+                  <w:tcBorders>
+                    <w:top w:val="nil"/>
+                    <w:left w:val="single" w:sz="8" w:space="0" w:color="auto"/>
+                    <w:bottom w:val="single" w:sz="4" w:space="0" w:color="auto"/>
+                    <w:right w:val="single" w:sz="4" w:space="0" w:color="auto"/>
+                  </w:tcBorders>
+                  <w:noWrap/>
+                  <w:vAlign w:val="center"/>
+                  <w:hideMark/>
+                </w:tcPr>
+                <w:p>
+                  <w:pPr>
+                    <w:framePr w:hSpace="141" w:wrap="around" w:vAnchor="text" w:hAnchor="text" w:y="-628"/>
+                    <w:spacing w:after="0" w:line="240" w:lineRule="auto"/>
+                    <w:jc w:val="center"/>
+                    <w:rPr>
+                      <w:rFonts w:ascii="Aptos Narrow" w:eastAsia="Times New Roman" w:hAnsi="Aptos Narrow"/>
+                      <w:color w:val="000000"/>
+                      <w:lang w:eastAsia="es-ES"/>
+                    </w:rPr>
+                  </w:pPr>
+                  <w:r>
+                    <w:rPr>
+                      <w:rFonts w:ascii="Aptos Narrow" w:eastAsia="Times New Roman" w:hAnsi="Aptos Narrow"/>
+                      <w:color w:val="000000"/>
+                      <w:lang w:eastAsia="es-ES"/>
+                    </w:rPr>
+                    <w:t>ED2K9A0Q0F</w:t>
+                  </w:r>
+                </w:p>
+              </w:tc>
+              <w:tc>
+                <w:tcPr>
+                  <w:tcW w:w="4198" w:type="dxa"/>
+                  <w:tcBorders>
+                    <w:top w:val="single" w:sz="4" w:space="0" w:color="auto"/>
+                    <w:left w:val="nil"/>
+                    <w:bottom w:val="single" w:sz="4" w:space="0" w:color="auto"/>
+                    <w:right w:val="single" w:sz="8" w:space="0" w:color="000000"/>
+                  </w:tcBorders>
+                  <w:noWrap/>
+                  <w:vAlign w:val="center"/>
+                  <w:hideMark/>
+                </w:tcPr>
+                <w:p>
+                  <w:pPr>
+                    <w:framePr w:hSpace="141" w:wrap="around" w:vAnchor="text" w:hAnchor="text" w:y="-628"/>
+                    <w:spacing w:after="0" w:line="240" w:lineRule="auto"/>
+                    <w:jc w:val="center"/>
+                    <w:rPr>
+                      <w:rFonts w:ascii="Aptos Narrow" w:eastAsia="Times New Roman" w:hAnsi="Aptos Narrow"/>
+                      <w:color w:val="000000"/>
+                      <w:lang w:eastAsia="es-ES"/>
+                    </w:rPr>
+                  </w:pPr>
+                  <w:r>
+                    <w:rPr>
+                      <w:rFonts w:ascii="Aptos Narrow" w:eastAsia="Times New Roman" w:hAnsi="Aptos Narrow"/>
+                      <w:color w:val="000000"/>
+                      <w:lang w:eastAsia="es-ES"/>
+                    </w:rPr>
+                    <w:t>TODO-GL-SCTASK2358770: Carga UUID México</w:t>
+                  </w:r>
+                </w:p>
+              </w:tc>
+            </w:tr>
+            <w:tr>
+              <w:trPr>
+                <w:trHeight w:val="444"/>
+              </w:trPr>
+              <w:tc>
+                <w:tcPr>
+                  <w:tcW w:w="1740" w:type="dxa"/>
+                  <w:tcBorders>
+                    <w:top w:val="nil"/>
+                    <w:left w:val="single" w:sz="8" w:space="0" w:color="auto"/>
+                    <w:bottom w:val="single" w:sz="4" w:space="0" w:color="auto"/>
+                    <w:right w:val="single" w:sz="4" w:space="0" w:color="auto"/>
+                  </w:tcBorders>
+                  <w:noWrap/>
+                  <w:vAlign w:val="center"/>
+                  <w:hideMark/>
+                </w:tcPr>
+                <w:p>
+                  <w:pPr>
+                    <w:framePr w:hSpace="141" w:wrap="around" w:vAnchor="text" w:hAnchor="text" w:y="-628"/>
+                    <w:spacing w:after="0" w:line="240" w:lineRule="auto"/>
+                    <w:jc w:val="center"/>
+                    <w:rPr>
+                      <w:rFonts w:ascii="Aptos Narrow" w:eastAsia="Times New Roman" w:hAnsi="Aptos Narrow"/>
+                      <w:color w:val="000000"/>
+                      <w:lang w:eastAsia="es-ES"/>
+                    </w:rPr>
+                  </w:pPr>
+                  <w:r>
+                    <w:rPr>
+                      <w:rFonts w:ascii="Aptos Narrow" w:eastAsia="Times New Roman" w:hAnsi="Aptos Narrow"/>
+                      <w:color w:val="000000"/>
+                      <w:lang w:eastAsia="es-ES"/>
+                    </w:rPr>
+                    <w:t>ED2K9A0Q0J</w:t>
+                  </w:r>
+                </w:p>
+              </w:tc>
+              <w:tc>
+                <w:tcPr>
+                  <w:tcW w:w="4198" w:type="dxa"/>
+                  <w:tcBorders>
+                    <w:top w:val="single" w:sz="4" w:space="0" w:color="auto"/>
+                    <w:left w:val="nil"/>
+                    <w:bottom w:val="single" w:sz="4" w:space="0" w:color="auto"/>
+                    <w:right w:val="single" w:sz="8" w:space="0" w:color="000000"/>
+                  </w:tcBorders>
+                  <w:noWrap/>
+                  <w:vAlign w:val="center"/>
+                  <w:hideMark/>
+                </w:tcPr>
+                <w:p>
+                  <w:pPr>
+                    <w:framePr w:hSpace="141" w:wrap="around" w:vAnchor="text" w:hAnchor="text" w:y="-628"/>
+                    <w:spacing w:after="0" w:line="240" w:lineRule="auto"/>
+                    <w:jc w:val="center"/>
+                    <w:rPr>
+                      <w:rFonts w:ascii="Aptos Narrow" w:eastAsia="Times New Roman" w:hAnsi="Aptos Narrow"/>
+                      <w:color w:val="000000"/>
+                      <w:lang w:eastAsia="es-ES"/>
+                    </w:rPr>
+                  </w:pPr>
+                  <w:r>
+                    <w:rPr>
+                      <w:rFonts w:ascii="Aptos Narrow" w:eastAsia="Times New Roman" w:hAnsi="Aptos Narrow"/>
+                      <w:color w:val="000000"/>
+                      <w:lang w:eastAsia="es-ES"/>
+                    </w:rPr>
+                    <w:t>TODO-GL-SCTASK2358770: Carga UUID México</w:t>
+                  </w:r>
+                </w:p>
+              </w:tc>
+            </w:tr>
+            <w:tr>
+              <w:trPr>
+                <w:trHeight w:val="444"/>
+              </w:trPr>
+              <w:tc>
+                <w:tcPr>
+                  <w:tcW w:w="1740" w:type="dxa"/>
+                  <w:tcBorders>
+                    <w:top w:val="nil"/>
+                    <w:left w:val="single" w:sz="8" w:space="0" w:color="auto"/>
+                    <w:bottom w:val="single" w:sz="4" w:space="0" w:color="auto"/>
+                    <w:right w:val="single" w:sz="4" w:space="0" w:color="auto"/>
+                  </w:tcBorders>
+                  <w:noWrap/>
+                  <w:vAlign w:val="center"/>
+                  <w:hideMark/>
+                </w:tcPr>
+                <w:p>
+                  <w:pPr>
+                    <w:framePr w:hSpace="141" w:wrap="around" w:vAnchor="text" w:hAnchor="text" w:y="-628"/>
+                    <w:spacing w:after="0" w:line="240" w:lineRule="auto"/>
+                    <w:jc w:val="center"/>
+                    <w:rPr>
+                      <w:rFonts w:ascii="Aptos Narrow" w:eastAsia="Times New Roman" w:hAnsi="Aptos Narrow"/>
+                      <w:color w:val="000000"/>
+                      <w:lang w:eastAsia="es-ES"/>
+                    </w:rPr>
+                  </w:pPr>
+                  <w:r>
+                    <w:rPr>
+                      <w:rFonts w:ascii="Aptos Narrow" w:eastAsia="Times New Roman" w:hAnsi="Aptos Narrow"/>
+                      <w:color w:val="000000"/>
+                      <w:lang w:eastAsia="es-ES"/>
+                    </w:rPr>
+                    <w:t>ED2K9A0Q0L</w:t>
+                  </w:r>
+                </w:p>
+              </w:tc>
+              <w:tc>
+                <w:tcPr>
+                  <w:tcW w:w="4198" w:type="dxa"/>
+                  <w:tcBorders>
+                    <w:top w:val="single" w:sz="4" w:space="0" w:color="auto"/>
+                    <w:left w:val="nil"/>
+                    <w:bottom w:val="single" w:sz="4" w:space="0" w:color="auto"/>
+                    <w:right w:val="single" w:sz="8" w:space="0" w:color="000000"/>
+                  </w:tcBorders>
+                  <w:noWrap/>
+                  <w:vAlign w:val="center"/>
+                  <w:hideMark/>
+                </w:tcPr>
+                <w:p>
+                  <w:pPr>
+                    <w:framePr w:hSpace="141" w:wrap="around" w:vAnchor="text" w:hAnchor="text" w:y="-628"/>
+                    <w:spacing w:after="0" w:line="240" w:lineRule="auto"/>
+                    <w:jc w:val="center"/>
+                    <w:rPr>
+                      <w:rFonts w:ascii="Aptos Narrow" w:eastAsia="Times New Roman" w:hAnsi="Aptos Narrow"/>
+                      <w:color w:val="000000"/>
+                      <w:lang w:eastAsia="es-ES"/>
+                    </w:rPr>
+                  </w:pPr>
+                  <w:r>
+                    <w:rPr>
+                      <w:rFonts w:ascii="Aptos Narrow" w:eastAsia="Times New Roman" w:hAnsi="Aptos Narrow"/>
+                      <w:color w:val="000000"/>
+                      <w:lang w:eastAsia="es-ES"/>
+                    </w:rPr>
+                    <w:t>TODO-GL-SCTASK2358770: Carga UUID México</w:t>
+                  </w:r>
+                </w:p>
+              </w:tc>
+            </w:tr>
+            <w:tr>
+              <w:trPr>
+                <w:trHeight w:val="444"/>
+              </w:trPr>
+              <w:tc>
+                <w:tcPr>
+                  <w:tcW w:w="1740" w:type="dxa"/>
                   <w:tcBorders>
                     <w:top w:val="nil"/>
                     <w:left w:val="single" w:sz="8" w:space="0" w:color="auto"/>
@@ -1556,57 +2476,61 @@
                     <w:right w:val="single" w:sz="4" w:space="0" w:color="auto"/>
                   </w:tcBorders>
                   <w:noWrap/>
-                  <w:vAlign w:val="bottom"/>
+                  <w:vAlign w:val="center"/>
                   <w:hideMark/>
                 </w:tcPr>
                 <w:p>
                   <w:pPr>
                     <w:framePr w:hSpace="141" w:wrap="around" w:vAnchor="text" w:hAnchor="text" w:y="-628"/>
+                    <w:spacing w:after="0" w:line="240" w:lineRule="auto"/>
+                    <w:jc w:val="center"/>
                     <w:rPr>
-                      <w:rFonts w:cs="Calibri"/>
+                      <w:rFonts w:ascii="Aptos Narrow" w:eastAsia="Times New Roman" w:hAnsi="Aptos Narrow"/>
                       <w:color w:val="000000"/>
                       <w:lang w:eastAsia="es-ES"/>
                     </w:rPr>
                   </w:pPr>
                   <w:r>
                     <w:rPr>
-                      <w:rFonts w:cs="Calibri"/>
+                      <w:rFonts w:ascii="Aptos Narrow" w:eastAsia="Times New Roman" w:hAnsi="Aptos Narrow"/>
                       <w:color w:val="000000"/>
                       <w:lang w:eastAsia="es-ES"/>
                     </w:rPr>
-                    <w:t>ED2K982100</w:t>
+                    <w:t>ED2K9A0Q0Z</w:t>
                   </w:r>
                 </w:p>
               </w:tc>
               <w:tc>
                 <w:tcPr>
-                  <w:tcW w:w="6520" w:type="dxa"/>
+                  <w:tcW w:w="4198" w:type="dxa"/>
                   <w:tcBorders>
-                    <w:top w:val="nil"/>
+                    <w:top w:val="single" w:sz="4" w:space="0" w:color="auto"/>
                     <w:left w:val="nil"/>
                     <w:bottom w:val="single" w:sz="8" w:space="0" w:color="auto"/>
-                    <w:right w:val="single" w:sz="8" w:space="0" w:color="auto"/>
+                    <w:right w:val="single" w:sz="8" w:space="0" w:color="000000"/>
                   </w:tcBorders>
                   <w:noWrap/>
-                  <w:vAlign w:val="bottom"/>
+                  <w:vAlign w:val="center"/>
                   <w:hideMark/>
                 </w:tcPr>
                 <w:p>
                   <w:pPr>
                     <w:framePr w:hSpace="141" w:wrap="around" w:vAnchor="text" w:hAnchor="text" w:y="-628"/>
+                    <w:spacing w:after="0" w:line="240" w:lineRule="auto"/>
+                    <w:jc w:val="center"/>
                     <w:rPr>
-                      <w:rFonts w:cs="Calibri"/>
+                      <w:rFonts w:ascii="Aptos Narrow" w:eastAsia="Times New Roman" w:hAnsi="Aptos Narrow"/>
                       <w:color w:val="000000"/>
                       <w:lang w:eastAsia="es-ES"/>
                     </w:rPr>
                   </w:pPr>
                   <w:r>
                     <w:rPr>
-                      <w:rFonts w:cs="Calibri"/>
+                      <w:rFonts w:ascii="Aptos Narrow" w:eastAsia="Times New Roman" w:hAnsi="Aptos Narrow"/>
                       <w:color w:val="000000"/>
                       <w:lang w:eastAsia="es-ES"/>
                     </w:rPr>
-                    <w:t xml:space="preserve"> TODO-TR-SCTASK1149689 Permisos carga extractos ENH FF_5</w:t>
+                    <w:t>TODO-GL-SCTASK2358770: Carga UUID México</w:t>
                   </w:r>
                 </w:p>
               </w:tc>
@@ -1699,6 +2623,7 @@
                 <w:sz w:val="28"/>
                 <w:szCs w:val="28"/>
               </w:rPr>
+              <w:lastRenderedPageBreak/>
               <w:t>Cambios a roles y autorizaciones. (</w:t>
             </w:r>
             <w:r>
@@ -2140,10 +3065,35 @@
           <w:p>
             <w:pPr>
               <w:spacing w:after="0"/>
-              <w:rPr>
-                <w:b/>
-              </w:rPr>
-            </w:pPr>
+            </w:pPr>
+            <w:r>
+              <w:t>Adjunto el documento con las pruebas realizadas</w:t>
+            </w:r>
+            <w:r>
+              <w:t>:</w:t>
+            </w:r>
+          </w:p>
+          <w:p>
+            <w:pPr>
+              <w:spacing w:after="0"/>
+            </w:pPr>
+          </w:p>
+          <w:p>
+            <w:pPr>
+              <w:spacing w:after="0"/>
+            </w:pPr>
+            <w:r>
+              <w:object w:dxaOrig="1520" w:dyaOrig="990" w14:anchorId="6455ED4F">
+                <v:shape id="_x0000_i1030" type="#_x0000_t75" style="width:76.2pt;height:49.8pt" o:ole="">
+                  <v:imagedata r:id="rId14" o:title=""/>
+                </v:shape>
+                <o:OLEObject Type="Link" ProgID="Word.Document.12" ShapeID="_x0000_i1030" DrawAspect="Icon" r:id="rId15" UpdateMode="Always">
+                  <o:LinkType>EnhancedMetaFile</o:LinkType>
+                  <o:LockedField>false</o:LockedField>
+                  <o:FieldCodes>\f 0</o:FieldCodes>
+                </o:OLEObject>
+              </w:object>
+            </w:r>
           </w:p>
           <w:p>
             <w:pPr>
@@ -2410,6 +3360,7 @@
                 <w:bCs/>
                 <w:u w:val="single"/>
               </w:rPr>
+              <w:lastRenderedPageBreak/>
               <w:t>SAP CORPORATIVO:</w:t>
             </w:r>
           </w:p>
@@ -2418,15 +3369,11 @@
               <w:spacing w:after="0"/>
             </w:pPr>
             <w:r>
-              <w:rPr>
-                <w:noProof/>
-                <w:lang w:eastAsia="es-ES"/>
-              </w:rPr>
               <w:drawing>
-                <wp:inline distT="0" distB="0" distL="0" distR="0" wp14:anchorId="647A727F" wp14:editId="55F319A7">
-                  <wp:extent cx="5486400" cy="1109980"/>
-                  <wp:effectExtent l="0" t="0" r="0" b="0"/>
-                  <wp:docPr id="6" name="Imagen 6"/>
+                <wp:inline distT="0" distB="0" distL="0" distR="0" wp14:anchorId="78D86A77" wp14:editId="21794A53">
+                  <wp:extent cx="5400040" cy="2392045"/>
+                  <wp:effectExtent l="0" t="0" r="0" b="8255"/>
+                  <wp:docPr id="1885082847" name="Imagen 1"/>
                   <wp:cNvGraphicFramePr>
                     <a:graphicFrameLocks xmlns:a="http://schemas.openxmlformats.org/drawingml/2006/main" noChangeAspect="1"/>
                   </wp:cNvGraphicFramePr>
@@ -2434,36 +3381,23 @@
                     <a:graphicData uri="http://schemas.openxmlformats.org/drawingml/2006/picture">
                       <pic:pic xmlns:pic="http://schemas.openxmlformats.org/drawingml/2006/picture">
                         <pic:nvPicPr>
-                          <pic:cNvPr id="0" name="Imagen 1"/>
-                          <pic:cNvPicPr>
-                            <a:picLocks noChangeAspect="1" noChangeArrowheads="1"/>
-                          </pic:cNvPicPr>
+                          <pic:cNvPr id="1885082847" name=""/>
+                          <pic:cNvPicPr/>
                         </pic:nvPicPr>
                         <pic:blipFill>
-                          <a:blip r:embed="rId12">
-                            <a:extLst>
-                              <a:ext uri="{28A0092B-C50C-407E-A947-70E740481C1C}">
-                                <a14:useLocalDpi xmlns:a14="http://schemas.microsoft.com/office/drawing/2010/main" val="0"/>
-                              </a:ext>
-                            </a:extLst>
-                          </a:blip>
-                          <a:srcRect/>
+                          <a:blip r:embed="rId16"/>
                           <a:stretch>
                             <a:fillRect/>
                           </a:stretch>
                         </pic:blipFill>
-                        <pic:spPr bwMode="auto">
+                        <pic:spPr>
                           <a:xfrm>
                             <a:off x="0" y="0"/>
-                            <a:ext cx="5486400" cy="1109980"/>
+                            <a:ext cx="5400040" cy="2392045"/>
                           </a:xfrm>
                           <a:prstGeom prst="rect">
                             <a:avLst/>
                           </a:prstGeom>
-                          <a:noFill/>
-                          <a:ln>
-                            <a:noFill/>
-                          </a:ln>
                         </pic:spPr>
                       </pic:pic>
                     </a:graphicData>
@@ -2485,60 +3419,6 @@
                 <w:u w:val="single"/>
               </w:rPr>
             </w:pPr>
-            <w:r>
-              <w:rPr>
-                <w:noProof/>
-                <w:lang w:eastAsia="es-ES"/>
-              </w:rPr>
-              <w:drawing>
-                <wp:inline distT="0" distB="0" distL="0" distR="0" wp14:anchorId="34403935" wp14:editId="7831E70E">
-                  <wp:extent cx="5491480" cy="877570"/>
-                  <wp:effectExtent l="0" t="0" r="0" b="0"/>
-                  <wp:docPr id="7" name="Imagen 7"/>
-                  <wp:cNvGraphicFramePr>
-                    <a:graphicFrameLocks xmlns:a="http://schemas.openxmlformats.org/drawingml/2006/main" noChangeAspect="1"/>
-                  </wp:cNvGraphicFramePr>
-                  <a:graphic xmlns:a="http://schemas.openxmlformats.org/drawingml/2006/main">
-                    <a:graphicData uri="http://schemas.openxmlformats.org/drawingml/2006/picture">
-                      <pic:pic xmlns:pic="http://schemas.openxmlformats.org/drawingml/2006/picture">
-                        <pic:nvPicPr>
-                          <pic:cNvPr id="0" name="Imagen 1"/>
-                          <pic:cNvPicPr>
-                            <a:picLocks noChangeAspect="1" noChangeArrowheads="1"/>
-                          </pic:cNvPicPr>
-                        </pic:nvPicPr>
-                        <pic:blipFill>
-                          <a:blip r:embed="rId13">
-                            <a:extLst>
-                              <a:ext uri="{28A0092B-C50C-407E-A947-70E740481C1C}">
-                                <a14:useLocalDpi xmlns:a14="http://schemas.microsoft.com/office/drawing/2010/main" val="0"/>
-                              </a:ext>
-                            </a:extLst>
-                          </a:blip>
-                          <a:srcRect/>
-                          <a:stretch>
-                            <a:fillRect/>
-                          </a:stretch>
-                        </pic:blipFill>
-                        <pic:spPr bwMode="auto">
-                          <a:xfrm>
-                            <a:off x="0" y="0"/>
-                            <a:ext cx="5491480" cy="877570"/>
-                          </a:xfrm>
-                          <a:prstGeom prst="rect">
-                            <a:avLst/>
-                          </a:prstGeom>
-                          <a:noFill/>
-                          <a:ln>
-                            <a:noFill/>
-                          </a:ln>
-                        </pic:spPr>
-                      </pic:pic>
-                    </a:graphicData>
-                  </a:graphic>
-                </wp:inline>
-              </w:drawing>
-            </w:r>
           </w:p>
           <w:p>
             <w:pPr>
@@ -2570,35 +3450,18 @@
               <w:t xml:space="preserve"> de verificación de código en las modificaciones realizadas:</w:t>
             </w:r>
           </w:p>
+          <w:bookmarkStart w:id="1" w:name="_MON_1837605633"/>
+          <w:bookmarkEnd w:id="1"/>
           <w:p>
             <w:pPr>
               <w:jc w:val="both"/>
             </w:pPr>
             <w:r>
-              <w:object w:dxaOrig="1534" w:dyaOrig="997" w14:anchorId="2AE60918">
-                <v:shapetype id="_x0000_t75" coordsize="21600,21600" o:spt="75" o:preferrelative="t" path="m@4@5l@4@11@9@11@9@5xe" filled="f" stroked="f">
-                  <v:stroke joinstyle="miter"/>
-                  <v:formulas>
-                    <v:f eqn="if lineDrawn pixelLineWidth 0"/>
-                    <v:f eqn="sum @0 1 0"/>
-                    <v:f eqn="sum 0 0 @1"/>
-                    <v:f eqn="prod @2 1 2"/>
-                    <v:f eqn="prod @3 21600 pixelWidth"/>
-                    <v:f eqn="prod @3 21600 pixelHeight"/>
-                    <v:f eqn="sum @0 0 1"/>
-                    <v:f eqn="prod @6 1 2"/>
-                    <v:f eqn="prod @7 21600 pixelWidth"/>
-                    <v:f eqn="sum @8 21600 0"/>
-                    <v:f eqn="prod @7 21600 pixelHeight"/>
-                    <v:f eqn="sum @10 21600 0"/>
-                  </v:formulas>
-                  <v:path o:extrusionok="f" gradientshapeok="t" o:connecttype="rect"/>
-                  <o:lock v:ext="edit" aspectratio="t"/>
-                </v:shapetype>
-                <v:shape id="_x0000_i1025" type="#_x0000_t75" style="width:76.9pt;height:49.9pt" o:ole="">
-                  <v:imagedata r:id="rId14" o:title=""/>
+              <w:object w:dxaOrig="1311" w:dyaOrig="849" w14:anchorId="2AE60918">
+                <v:shape id="_x0000_i1029" type="#_x0000_t75" style="width:65.4pt;height:42.6pt" o:ole="">
+                  <v:imagedata r:id="rId17" o:title=""/>
                 </v:shape>
-                <o:OLEObject Type="Embed" ProgID="Excel.Sheet.12" ShapeID="_x0000_i1025" DrawAspect="Icon" ObjectID="_1837601365" r:id="rId15"/>
+                <o:OLEObject Type="Embed" ProgID="Excel.Sheet.12" ShapeID="_x0000_i1029" DrawAspect="Icon" ObjectID="_1837606530" r:id="rId18"/>
               </w:object>
             </w:r>
           </w:p>
@@ -2819,6 +3682,7 @@
                 <w:sz w:val="28"/>
                 <w:szCs w:val="28"/>
               </w:rPr>
+              <w:lastRenderedPageBreak/>
               <w:t>Estimación de cambios (Mejoras y Evolutivos). (</w:t>
             </w:r>
             <w:r>
@@ -3346,10 +4210,10 @@
                 <w:lang w:val="es-ES"/>
               </w:rPr>
               <w:object w:dxaOrig="1539" w:dyaOrig="997" w14:anchorId="49625892">
-                <v:shape id="_x0000_i1026" type="#_x0000_t75" style="width:77.25pt;height:49.9pt" o:ole="">
-                  <v:imagedata r:id="rId16" o:title=""/>
+                <v:shape id="_x0000_i1026" type="#_x0000_t75" style="width:77.4pt;height:49.8pt" o:ole="">
+                  <v:imagedata r:id="rId19" o:title=""/>
                 </v:shape>
-                <o:OLEObject Type="Embed" ProgID="Package" ShapeID="_x0000_i1026" DrawAspect="Icon" ObjectID="_1837601366" r:id="rId17"/>
+                <o:OLEObject Type="Embed" ProgID="Package" ShapeID="_x0000_i1026" DrawAspect="Icon" ObjectID="_1837606531" r:id="rId20"/>
               </w:object>
             </w:r>
           </w:p>
@@ -3644,8 +4508,8 @@
     </w:tbl>
     <w:p/>
     <w:sectPr>
-      <w:headerReference w:type="default" r:id="rId18"/>
-      <w:footerReference w:type="default" r:id="rId19"/>
+      <w:headerReference w:type="default" r:id="rId21"/>
+      <w:footerReference w:type="default" r:id="rId22"/>
       <w:pgSz w:w="11906" w:h="16838"/>
       <w:pgMar w:top="1417" w:right="1701" w:bottom="1417" w:left="1701" w:header="708" w:footer="708" w:gutter="0"/>
       <w:cols w:space="708"/>
@@ -7389,7 +8253,6 @@
   <w:style w:type="character" w:default="1" w:styleId="Fuentedeprrafopredeter">
     <w:name w:val="Default Paragraph Font"/>
     <w:uiPriority w:val="1"/>
-    <w:semiHidden/>
     <w:unhideWhenUsed/>
   </w:style>
   <w:style w:type="table" w:default="1" w:styleId="Tablanormal">

</xml_diff>